<commit_message>
Problems/Challeges faced So far
</commit_message>
<xml_diff>
--- a/Problems Found/SQL SERVER IMPORTATION PROBLEM.docx
+++ b/Problems Found/SQL SERVER IMPORTATION PROBLEM.docx
@@ -55,6 +55,42 @@
           <w:szCs w:val="40"/>
         </w:rPr>
         <w:t xml:space="preserve"> PROBLEM</w:t>
+      </w:r>
+    </w:p>
+    <w:p>
+      <w:pPr>
+        <w:pStyle w:val="ListParagraph"/>
+        <w:rPr>
+          <w:b/>
+          <w:bCs/>
+        </w:rPr>
+      </w:pPr>
+      <w:r>
+        <w:rPr>
+          <w:b/>
+          <w:bCs/>
+        </w:rPr>
+        <w:t>PROBLEM 1</w:t>
+      </w:r>
+      <w:r>
+        <w:rPr>
+          <mc:AlternateContent>
+            <mc:Choice Requires="w16se"/>
+            <mc:Fallback>
+              <w:rFonts w:ascii="Segoe UI Emoji" w:eastAsia="Segoe UI Emoji" w:hAnsi="Segoe UI Emoji" w:cs="Segoe UI Emoji"/>
+            </mc:Fallback>
+          </mc:AlternateContent>
+          <w:b/>
+          <w:bCs/>
+        </w:rPr>
+        <mc:AlternateContent>
+          <mc:Choice Requires="w16se">
+            <w16se:symEx w16se:font="Segoe UI Emoji" w16se:char="26A0"/>
+          </mc:Choice>
+          <mc:Fallback>
+            <w:t>⚠</w:t>
+          </mc:Fallback>
+        </mc:AlternateContent>
       </w:r>
     </w:p>
     <w:p>
@@ -70,7 +106,7 @@
           <w:noProof/>
         </w:rPr>
         <w:drawing>
-          <wp:anchor distT="0" distB="0" distL="114300" distR="114300" simplePos="0" relativeHeight="251658240" behindDoc="0" locked="0" layoutInCell="1" allowOverlap="1" wp14:anchorId="1B2EB716" wp14:editId="6FC78E98">
+          <wp:anchor distT="0" distB="0" distL="114300" distR="114300" simplePos="0" relativeHeight="251658240" behindDoc="0" locked="0" layoutInCell="1" allowOverlap="1" wp14:anchorId="1B2EB716" wp14:editId="40D9267C">
             <wp:simplePos x="0" y="0"/>
             <wp:positionH relativeFrom="column">
               <wp:posOffset>-730250</wp:posOffset>
@@ -171,6 +207,515 @@
       <w:r>
         <w:t xml:space="preserve"> cryptic/Variable column names.</w:t>
       </w:r>
+    </w:p>
+    <w:p/>
+    <w:p/>
+    <w:p/>
+    <w:p/>
+    <w:p/>
+    <w:p/>
+    <w:p/>
+    <w:p/>
+    <w:p/>
+    <w:p/>
+    <w:p/>
+    <w:p/>
+    <w:p/>
+    <w:p/>
+    <w:p/>
+    <w:p/>
+    <w:p/>
+    <w:p/>
+    <w:p/>
+    <w:p/>
+    <w:p/>
+    <w:p/>
+    <w:p/>
+    <w:p/>
+    <w:p/>
+    <w:p/>
+    <w:p/>
+    <w:p>
+      <w:pPr>
+        <w:jc w:val="center"/>
+        <w:rPr>
+          <w:b/>
+          <w:bCs/>
+          <w:sz w:val="40"/>
+          <w:szCs w:val="40"/>
+        </w:rPr>
+      </w:pPr>
+      <w:r>
+        <w:rPr>
+          <w:b/>
+          <w:bCs/>
+          <w:sz w:val="40"/>
+          <w:szCs w:val="40"/>
+        </w:rPr>
+        <w:t>MANUAL ALTERATION OF COLUMN NAMES</w:t>
+      </w:r>
+    </w:p>
+    <w:p>
+      <w:pPr>
+        <w:pStyle w:val="NoSpacing"/>
+        <w:rPr>
+          <w:b/>
+          <w:bCs/>
+        </w:rPr>
+      </w:pPr>
+      <w:r>
+        <w:rPr>
+          <w:b/>
+          <w:bCs/>
+        </w:rPr>
+        <w:tab/>
+      </w:r>
+      <w:r>
+        <w:rPr>
+          <mc:AlternateContent>
+            <mc:Choice Requires="w16se"/>
+            <mc:Fallback>
+              <w:rFonts w:ascii="Segoe UI Emoji" w:eastAsia="Segoe UI Emoji" w:hAnsi="Segoe UI Emoji" w:cs="Segoe UI Emoji"/>
+            </mc:Fallback>
+          </mc:AlternateContent>
+          <w:b/>
+          <w:bCs/>
+        </w:rPr>
+        <mc:AlternateContent>
+          <mc:Choice Requires="w16se">
+            <w16se:symEx w16se:font="Segoe UI Emoji" w16se:char="26A0"/>
+          </mc:Choice>
+          <mc:Fallback>
+            <w:t>⚠</w:t>
+          </mc:Fallback>
+        </mc:AlternateContent>
+      </w:r>
+      <w:r>
+        <w:rPr>
+          <w:b/>
+          <w:bCs/>
+        </w:rPr>
+        <w:t>PROBLEM 2:</w:t>
+      </w:r>
+      <w:r>
+        <w:rPr>
+          <w:b/>
+          <w:bCs/>
+        </w:rPr>
+        <w:tab/>
+      </w:r>
+      <w:r>
+        <w:rPr>
+          <w:b/>
+          <w:bCs/>
+        </w:rPr>
+        <w:tab/>
+      </w:r>
+    </w:p>
+    <w:p>
+      <w:pPr>
+        <w:pStyle w:val="NoSpacing"/>
+        <w:numPr>
+          <w:ilvl w:val="0"/>
+          <w:numId w:val="1"/>
+        </w:numPr>
+      </w:pPr>
+      <w:r>
+        <w:t xml:space="preserve">After importation of Raw </w:t>
+      </w:r>
+      <w:proofErr w:type="gramStart"/>
+      <w:r>
+        <w:t>Files  in</w:t>
+      </w:r>
+      <w:proofErr w:type="gramEnd"/>
+      <w:r>
+        <w:t xml:space="preserve"> the Landing </w:t>
+      </w:r>
+      <w:proofErr w:type="gramStart"/>
+      <w:r>
+        <w:t>Zone(</w:t>
+      </w:r>
+      <w:proofErr w:type="gramEnd"/>
+      <w:r>
+        <w:t>Malaria DB), We have to manually rename back the column names to the original column names which time consuming and Hectic.</w:t>
+      </w:r>
+      <w:r>
+        <w:t xml:space="preserve"> This method is not scalable for multiple large datasets</w:t>
+      </w:r>
+      <w:r>
+        <w:t>.</w:t>
+      </w:r>
+    </w:p>
+    <w:p>
+      <w:pPr>
+        <w:pStyle w:val="NoSpacing"/>
+      </w:pPr>
+      <w:r>
+        <w:rPr>
+          <w:b/>
+          <w:bCs/>
+          <w:noProof/>
+          <w:sz w:val="40"/>
+          <w:szCs w:val="40"/>
+        </w:rPr>
+        <w:drawing>
+          <wp:inline distT="0" distB="0" distL="0" distR="0" wp14:anchorId="1952E1E4" wp14:editId="21D7AEE0">
+            <wp:extent cx="6443003" cy="4425841"/>
+            <wp:effectExtent l="0" t="0" r="0" b="0"/>
+            <wp:docPr id="2060365443" name="Picture 1"/>
+            <wp:cNvGraphicFramePr>
+              <a:graphicFrameLocks xmlns:a="http://schemas.openxmlformats.org/drawingml/2006/main" noChangeAspect="1"/>
+            </wp:cNvGraphicFramePr>
+            <a:graphic xmlns:a="http://schemas.openxmlformats.org/drawingml/2006/main">
+              <a:graphicData uri="http://schemas.openxmlformats.org/drawingml/2006/picture">
+                <pic:pic xmlns:pic="http://schemas.openxmlformats.org/drawingml/2006/picture">
+                  <pic:nvPicPr>
+                    <pic:cNvPr id="0" name="Picture 1"/>
+                    <pic:cNvPicPr>
+                      <a:picLocks noChangeAspect="1" noChangeArrowheads="1"/>
+                    </pic:cNvPicPr>
+                  </pic:nvPicPr>
+                  <pic:blipFill rotWithShape="1">
+                    <a:blip r:embed="rId6">
+                      <a:extLst>
+                        <a:ext uri="{28A0092B-C50C-407E-A947-70E740481C1C}">
+                          <a14:useLocalDpi xmlns:a14="http://schemas.microsoft.com/office/drawing/2010/main" val="0"/>
+                        </a:ext>
+                      </a:extLst>
+                    </a:blip>
+                    <a:srcRect l="-1" t="39075" r="-1996" b="6770"/>
+                    <a:stretch>
+                      <a:fillRect/>
+                    </a:stretch>
+                  </pic:blipFill>
+                  <pic:spPr bwMode="auto">
+                    <a:xfrm>
+                      <a:off x="0" y="0"/>
+                      <a:ext cx="6449559" cy="4430345"/>
+                    </a:xfrm>
+                    <a:prstGeom prst="rect">
+                      <a:avLst/>
+                    </a:prstGeom>
+                    <a:noFill/>
+                    <a:ln>
+                      <a:noFill/>
+                    </a:ln>
+                    <a:extLst>
+                      <a:ext uri="{53640926-AAD7-44D8-BBD7-CCE9431645EC}">
+                        <a14:shadowObscured xmlns:a14="http://schemas.microsoft.com/office/drawing/2010/main"/>
+                      </a:ext>
+                    </a:extLst>
+                  </pic:spPr>
+                </pic:pic>
+              </a:graphicData>
+            </a:graphic>
+          </wp:inline>
+        </w:drawing>
+      </w:r>
+    </w:p>
+    <w:p>
+      <w:pPr>
+        <w:pStyle w:val="NoSpacing"/>
+      </w:pPr>
+    </w:p>
+    <w:p>
+      <w:pPr>
+        <w:pStyle w:val="NoSpacing"/>
+      </w:pPr>
+    </w:p>
+    <w:p>
+      <w:pPr>
+        <w:pStyle w:val="NoSpacing"/>
+      </w:pPr>
+    </w:p>
+    <w:p>
+      <w:pPr>
+        <w:pStyle w:val="NoSpacing"/>
+      </w:pPr>
+    </w:p>
+    <w:p>
+      <w:pPr>
+        <w:pStyle w:val="NoSpacing"/>
+      </w:pPr>
+    </w:p>
+    <w:p>
+      <w:pPr>
+        <w:pStyle w:val="NoSpacing"/>
+      </w:pPr>
+    </w:p>
+    <w:p>
+      <w:pPr>
+        <w:pStyle w:val="NoSpacing"/>
+      </w:pPr>
+    </w:p>
+    <w:p>
+      <w:pPr>
+        <w:pStyle w:val="NoSpacing"/>
+      </w:pPr>
+    </w:p>
+    <w:p>
+      <w:pPr>
+        <w:pStyle w:val="NoSpacing"/>
+      </w:pPr>
+    </w:p>
+    <w:p>
+      <w:pPr>
+        <w:pStyle w:val="NoSpacing"/>
+      </w:pPr>
+    </w:p>
+    <w:p>
+      <w:pPr>
+        <w:pStyle w:val="NoSpacing"/>
+      </w:pPr>
+    </w:p>
+    <w:p>
+      <w:pPr>
+        <w:pStyle w:val="NoSpacing"/>
+      </w:pPr>
+    </w:p>
+    <w:p>
+      <w:pPr>
+        <w:pStyle w:val="NoSpacing"/>
+      </w:pPr>
+    </w:p>
+    <w:p>
+      <w:pPr>
+        <w:pStyle w:val="NoSpacing"/>
+      </w:pPr>
+    </w:p>
+    <w:p>
+      <w:pPr>
+        <w:pStyle w:val="NoSpacing"/>
+      </w:pPr>
+    </w:p>
+    <w:p>
+      <w:pPr>
+        <w:pStyle w:val="NoSpacing"/>
+      </w:pPr>
+    </w:p>
+    <w:p>
+      <w:pPr>
+        <w:pStyle w:val="NoSpacing"/>
+      </w:pPr>
+    </w:p>
+    <w:p>
+      <w:pPr>
+        <w:pStyle w:val="NoSpacing"/>
+      </w:pPr>
+    </w:p>
+    <w:p>
+      <w:pPr>
+        <w:pStyle w:val="NoSpacing"/>
+      </w:pPr>
+    </w:p>
+    <w:p>
+      <w:pPr>
+        <w:pStyle w:val="NoSpacing"/>
+      </w:pPr>
+    </w:p>
+    <w:p>
+      <w:pPr>
+        <w:pStyle w:val="NoSpacing"/>
+        <w:jc w:val="center"/>
+        <w:rPr>
+          <w:b/>
+          <w:bCs/>
+          <w:sz w:val="40"/>
+          <w:szCs w:val="40"/>
+        </w:rPr>
+      </w:pPr>
+      <w:r>
+        <w:rPr>
+          <w:b/>
+          <w:bCs/>
+          <w:sz w:val="40"/>
+          <w:szCs w:val="40"/>
+        </w:rPr>
+        <w:t>MANUAL CHANGE IN DATATYPES</w:t>
+      </w:r>
+    </w:p>
+    <w:p>
+      <w:pPr>
+        <w:pStyle w:val="NoSpacing"/>
+        <w:rPr>
+          <w:b/>
+          <w:bCs/>
+        </w:rPr>
+      </w:pPr>
+      <w:r>
+        <w:rPr>
+          <mc:AlternateContent>
+            <mc:Choice Requires="w16se"/>
+            <mc:Fallback>
+              <w:rFonts w:ascii="Segoe UI Emoji" w:eastAsia="Segoe UI Emoji" w:hAnsi="Segoe UI Emoji" w:cs="Segoe UI Emoji"/>
+            </mc:Fallback>
+          </mc:AlternateContent>
+          <w:b/>
+          <w:bCs/>
+        </w:rPr>
+        <mc:AlternateContent>
+          <mc:Choice Requires="w16se">
+            <w16se:symEx w16se:font="Segoe UI Emoji" w16se:char="26A0"/>
+          </mc:Choice>
+          <mc:Fallback>
+            <w:t>⚠</w:t>
+          </mc:Fallback>
+        </mc:AlternateContent>
+      </w:r>
+      <w:r>
+        <w:rPr>
+          <w:b/>
+          <w:bCs/>
+        </w:rPr>
+        <w:t xml:space="preserve">PROBLEM3 </w:t>
+      </w:r>
+    </w:p>
+    <w:p>
+      <w:pPr>
+        <w:pStyle w:val="NoSpacing"/>
+        <w:numPr>
+          <w:ilvl w:val="0"/>
+          <w:numId w:val="1"/>
+        </w:numPr>
+      </w:pPr>
+      <w:r>
+        <w:t xml:space="preserve">Manual altering of columns to suitable datatypes for useability like </w:t>
+      </w:r>
+      <w:r>
+        <w:rPr>
+          <w:b/>
+          <w:bCs/>
+        </w:rPr>
+        <w:t>INT</w:t>
+      </w:r>
+      <w:r>
+        <w:t xml:space="preserve">, </w:t>
+      </w:r>
+      <w:r>
+        <w:rPr>
+          <w:b/>
+          <w:bCs/>
+        </w:rPr>
+        <w:t>f</w:t>
+      </w:r>
+      <w:r>
+        <w:rPr>
+          <w:b/>
+          <w:bCs/>
+        </w:rPr>
+        <w:t>loat.</w:t>
+      </w:r>
+      <w:r>
+        <w:t xml:space="preserve"> which is very hectic and non-scalable for big datasets for example a raw data set with more than 80 columns </w:t>
+      </w:r>
+    </w:p>
+    <w:p>
+      <w:pPr>
+        <w:pStyle w:val="NoSpacing"/>
+        <w:ind w:left="720"/>
+        <w:rPr>
+          <w:noProof/>
+        </w:rPr>
+      </w:pPr>
+      <w:r>
+        <w:rPr>
+          <w:noProof/>
+        </w:rPr>
+        <w:drawing>
+          <wp:anchor distT="0" distB="0" distL="114300" distR="114300" simplePos="0" relativeHeight="251659264" behindDoc="0" locked="0" layoutInCell="1" allowOverlap="1" wp14:anchorId="23C3EC35" wp14:editId="75C4BD6C">
+            <wp:simplePos x="0" y="0"/>
+            <wp:positionH relativeFrom="margin">
+              <wp:posOffset>-152400</wp:posOffset>
+            </wp:positionH>
+            <wp:positionV relativeFrom="page">
+              <wp:posOffset>2584450</wp:posOffset>
+            </wp:positionV>
+            <wp:extent cx="6203950" cy="5269865"/>
+            <wp:effectExtent l="0" t="0" r="6350" b="6985"/>
+            <wp:wrapNone/>
+            <wp:docPr id="1882768169" name="Picture 2"/>
+            <wp:cNvGraphicFramePr>
+              <a:graphicFrameLocks xmlns:a="http://schemas.openxmlformats.org/drawingml/2006/main" noChangeAspect="1"/>
+            </wp:cNvGraphicFramePr>
+            <a:graphic xmlns:a="http://schemas.openxmlformats.org/drawingml/2006/main">
+              <a:graphicData uri="http://schemas.openxmlformats.org/drawingml/2006/picture">
+                <pic:pic xmlns:pic="http://schemas.openxmlformats.org/drawingml/2006/picture">
+                  <pic:nvPicPr>
+                    <pic:cNvPr id="0" name="Picture 2"/>
+                    <pic:cNvPicPr>
+                      <a:picLocks noChangeAspect="1" noChangeArrowheads="1"/>
+                    </pic:cNvPicPr>
+                  </pic:nvPicPr>
+                  <pic:blipFill rotWithShape="1">
+                    <a:blip r:embed="rId7">
+                      <a:extLst>
+                        <a:ext uri="{28A0092B-C50C-407E-A947-70E740481C1C}">
+                          <a14:useLocalDpi xmlns:a14="http://schemas.microsoft.com/office/drawing/2010/main" val="0"/>
+                        </a:ext>
+                      </a:extLst>
+                    </a:blip>
+                    <a:srcRect t="8523" r="879" b="25312"/>
+                    <a:stretch>
+                      <a:fillRect/>
+                    </a:stretch>
+                  </pic:blipFill>
+                  <pic:spPr bwMode="auto">
+                    <a:xfrm>
+                      <a:off x="0" y="0"/>
+                      <a:ext cx="6203950" cy="5269865"/>
+                    </a:xfrm>
+                    <a:prstGeom prst="rect">
+                      <a:avLst/>
+                    </a:prstGeom>
+                    <a:noFill/>
+                    <a:ln>
+                      <a:noFill/>
+                    </a:ln>
+                    <a:extLst>
+                      <a:ext uri="{53640926-AAD7-44D8-BBD7-CCE9431645EC}">
+                        <a14:shadowObscured xmlns:a14="http://schemas.microsoft.com/office/drawing/2010/main"/>
+                      </a:ext>
+                    </a:extLst>
+                  </pic:spPr>
+                </pic:pic>
+              </a:graphicData>
+            </a:graphic>
+            <wp14:sizeRelH relativeFrom="margin">
+              <wp14:pctWidth>0</wp14:pctWidth>
+            </wp14:sizeRelH>
+            <wp14:sizeRelV relativeFrom="margin">
+              <wp14:pctHeight>0</wp14:pctHeight>
+            </wp14:sizeRelV>
+          </wp:anchor>
+        </w:drawing>
+      </w:r>
+    </w:p>
+    <w:p>
+      <w:pPr>
+        <w:pStyle w:val="NoSpacing"/>
+        <w:ind w:left="720"/>
+      </w:pPr>
+    </w:p>
+    <w:p>
+      <w:pPr>
+        <w:rPr>
+          <w:b/>
+          <w:bCs/>
+          <w:noProof/>
+          <w:sz w:val="40"/>
+          <w:szCs w:val="40"/>
+        </w:rPr>
+      </w:pPr>
+    </w:p>
+    <w:p>
+      <w:pPr>
+        <w:rPr>
+          <w:b/>
+          <w:bCs/>
+          <w:sz w:val="40"/>
+          <w:szCs w:val="40"/>
+        </w:rPr>
+      </w:pPr>
     </w:p>
     <w:sectPr>
       <w:pgSz w:w="11906" w:h="16838"/>
@@ -1219,6 +1764,15 @@
       <w:spacing w:val="5"/>
     </w:rPr>
   </w:style>
+  <w:style w:type="paragraph" w:styleId="NoSpacing">
+    <w:name w:val="No Spacing"/>
+    <w:uiPriority w:val="1"/>
+    <w:qFormat/>
+    <w:rsid w:val="00FE1ED2"/>
+    <w:pPr>
+      <w:spacing w:after="0" w:line="240" w:lineRule="auto"/>
+    </w:pPr>
+  </w:style>
 </w:styles>
 </file>
 

</xml_diff>